<commit_message>
Add member identity and leave document rules
</commit_message>
<xml_diff>
--- a/backend/app/templates/school_leave.docx
+++ b/backend/app/templates/school_leave.docx
@@ -47,79 +47,7 @@
           <w:szCs w:val="28"/>
           <w:lang w:val="zh-TW" w:eastAsia="zh-TW"/>
         </w:rPr>
-        <w:t>以下学生因参加</w:t>
-      </w:r>
-      <w:r>
-        <w:rPr>
-          <w:rFonts w:eastAsia="Arial Unicode MS" w:hint="eastAsia"/>
-          <w:sz w:val="28"/>
-          <w:szCs w:val="28"/>
-          <w:lang w:val="zh-TW" w:eastAsia="zh-TW"/>
-        </w:rPr>
-        <w:t>9</w:t>
-      </w:r>
-      <w:r>
-        <w:rPr>
-          <w:rFonts w:eastAsia="Arial Unicode MS" w:hint="eastAsia"/>
-          <w:sz w:val="28"/>
-          <w:szCs w:val="28"/>
-          <w:lang w:val="zh-TW" w:eastAsia="zh-TW"/>
-        </w:rPr>
-        <w:t>月</w:t>
-      </w:r>
-      <w:r>
-        <w:rPr>
-          <w:rFonts w:eastAsia="Arial Unicode MS" w:hint="eastAsia"/>
-          <w:sz w:val="28"/>
-          <w:szCs w:val="28"/>
-          <w:lang w:val="zh-TW" w:eastAsia="zh-TW"/>
-        </w:rPr>
-        <w:t>20</w:t>
-      </w:r>
-      <w:r>
-        <w:rPr>
-          <w:rFonts w:eastAsia="Arial Unicode MS" w:hint="eastAsia"/>
-          <w:sz w:val="28"/>
-          <w:szCs w:val="28"/>
-          <w:lang w:val="zh-TW" w:eastAsia="zh-TW"/>
-        </w:rPr>
-        <w:t>日下午</w:t>
-      </w:r>
-      <w:r>
-        <w:rPr>
-          <w:rFonts w:eastAsia="Arial Unicode MS" w:hint="eastAsia"/>
-          <w:sz w:val="28"/>
-          <w:szCs w:val="28"/>
-          <w:lang w:val="zh-TW" w:eastAsia="zh-TW"/>
-        </w:rPr>
-        <w:t>3</w:t>
-      </w:r>
-      <w:r>
-        <w:rPr>
-          <w:rFonts w:eastAsia="Arial Unicode MS" w:hint="eastAsia"/>
-          <w:sz w:val="28"/>
-          <w:szCs w:val="28"/>
-          <w:lang w:val="zh-TW" w:eastAsia="zh-TW"/>
-        </w:rPr>
-        <w:t>点到</w:t>
-      </w:r>
-      <w:r>
-        <w:rPr>
-          <w:rFonts w:eastAsia="Arial Unicode MS" w:hint="eastAsia"/>
-          <w:sz w:val="28"/>
-          <w:szCs w:val="28"/>
-          <w:lang w:val="zh-TW" w:eastAsia="zh-TW"/>
-        </w:rPr>
-        <w:t>5</w:t>
-      </w:r>
-      <w:r>
-        <w:rPr>
-          <w:rFonts w:eastAsia="Arial Unicode MS" w:hint="eastAsia"/>
-          <w:sz w:val="28"/>
-          <w:szCs w:val="28"/>
-          <w:lang w:val="zh-TW" w:eastAsia="zh-TW"/>
-        </w:rPr>
-        <w:t>点的吉甲大师双创基地参观接待活动，不能参加下午课程，特此证明。</w:t>
+        <w:t xml:space="preserve">以下学生因参加2026 年 10 月 6 日 13:00 至 17:00的吉甲大师双创基地机器人战队创新实践活动，不能参加下午课程，特此证明。</w:t>
       </w:r>
     </w:p>
     <w:p>

</xml_diff>